<commit_message>
Block Method batch 2: audit fixes applied pre-delivery
Blocking fix: Nicolette Scott Day B C->D boundary carried a pre-existing
three-pull stack (Face Pull/Reverse Fly -> SA Row -> Bent-Over Row) in all
four of her documents — the configuration Mary Burfete's 8/16 fix
established as a violation. Push Press moved between the rows in both
scripts; intros updated; rendered-order walk re-verified clean.
Polish: Johnna Macarthur's not-tested Incline DB Press aligned to the
3+ RIR new-pattern band (was 2 RIR, inconsistent with her other two new
baselines); Aimee 'Neural grip' typo; Mary script-comment date fix.
Deferred to next touch per audit: Nicolette per-exercise RIR
instrumentation (documented in CLIENTS.md).

Co-Authored-By: Claude Fable 5 <noreply@anthropic.com>
Claude-Session: https://claude.ai/code/session_01VTRA12TAy4P16NRVKS4SK5
</commit_message>
<xml_diff>
--- a/clients/nicolette_scott/Nicolette_Scott_2Day_AtHome_Training_Plan.docx
+++ b/clients/nicolette_scott/Nicolette_Scott_2Day_AtHome_Training_Plan.docx
@@ -9890,7 +9890,7 @@
           <w:sz w:val="17"/>
           <w:szCs w:val="17"/>
         </w:rPr>
-        <w:t xml:space="preserve">The day's second compound pattern — pulling, rotating off the squat and lunge work above. Row was not part of the tested 10-pattern battery — today's working loads become the new 8-week baseline for both rows, tracked the same as every tested lift. No side-lead is applied to Single-Arm Row — the arm-to-arm difference here is minor. Same exercises and loads as the studio version — no equipment substitution needed here. If the row needs a variation: a chest-supported DB row (lying prone on the bench) or a staggered-stance single-arm row (free hand braced on the knee) covers the same pattern; today's rows stay the lifts we track.</w:t>
+        <w:t xml:space="preserve">The day's second compound pattern — pulling, rotating off the squat and lunge work above, with the push press breaking up the two rows so the pulling muscles get a breather mid-block. Row was not part of the tested 10-pattern battery — today's working loads become the new 8-week baseline for both rows, tracked the same as every tested lift. No side-lead is applied to Single-Arm Row — the arm-to-arm difference here is minor. Same exercises and loads as the studio version — no equipment substitution needed here. If the row needs a variation: a chest-supported DB row (lying prone on the bench) or a staggered-stance single-arm row (free hand braced on the knee) covers the same pattern; today's rows stay the lifts we track.</w:t>
       </w:r>
     </w:p>
     <w:tbl>
@@ -10419,7 +10419,7 @@
                 <w:sz w:val="18"/>
                 <w:szCs w:val="18"/>
               </w:rPr>
-              <w:t xml:space="preserve">Bent-Over DB Row (Both Arms)</w:t>
+              <w:t xml:space="preserve">Standing DB Push Press</w:t>
             </w:r>
           </w:p>
         </w:tc>
@@ -10485,7 +10485,7 @@
                 <w:sz w:val="15"/>
                 <w:szCs w:val="15"/>
               </w:rPr>
-              <w:t xml:space="preserve">10</w:t>
+              <w:t xml:space="preserve">8</w:t>
             </w:r>
           </w:p>
         </w:tc>
@@ -10518,7 +10518,7 @@
                 <w:sz w:val="15"/>
                 <w:szCs w:val="15"/>
               </w:rPr>
-              <w:t xml:space="preserve">Wk1: 12.5 lbs/hand → Wk4: 17.5 lbs/hand</w:t>
+              <w:t xml:space="preserve">Wk1: 10 lbs/hand → Wk4: 12.5 lbs/hand</w:t>
             </w:r>
           </w:p>
         </w:tc>
@@ -10551,7 +10551,7 @@
                 <w:sz w:val="15"/>
                 <w:szCs w:val="15"/>
               </w:rPr>
-              <w:t xml:space="preserve">2-1-2</w:t>
+              <w:t xml:space="preserve">2-1-1</w:t>
             </w:r>
           </w:p>
         </w:tc>
@@ -10614,7 +10614,7 @@
                 <w:sz w:val="17"/>
                 <w:szCs w:val="17"/>
               </w:rPr>
-              <w:t xml:space="preserve">Hip hinge, flat back, pull both DBs to lower ribs.</w:t>
+              <w:t xml:space="preserve">Slight knee dip, drive up and press overhead in one motion.</w:t>
             </w:r>
           </w:p>
         </w:tc>
@@ -10648,7 +10648,7 @@
                 <w:sz w:val="18"/>
                 <w:szCs w:val="18"/>
               </w:rPr>
-              <w:t xml:space="preserve">Standing DB Push Press</w:t>
+              <w:t xml:space="preserve">Bent-Over DB Row (Both Arms)</w:t>
             </w:r>
           </w:p>
         </w:tc>
@@ -10714,7 +10714,7 @@
                 <w:sz w:val="15"/>
                 <w:szCs w:val="15"/>
               </w:rPr>
-              <w:t xml:space="preserve">8</w:t>
+              <w:t xml:space="preserve">10</w:t>
             </w:r>
           </w:p>
         </w:tc>
@@ -10747,7 +10747,7 @@
                 <w:sz w:val="15"/>
                 <w:szCs w:val="15"/>
               </w:rPr>
-              <w:t xml:space="preserve">Wk1: 10 lbs/hand → Wk4: 12.5 lbs/hand</w:t>
+              <w:t xml:space="preserve">Wk1: 12.5 lbs/hand → Wk4: 17.5 lbs/hand</w:t>
             </w:r>
           </w:p>
         </w:tc>
@@ -10780,7 +10780,7 @@
                 <w:sz w:val="15"/>
                 <w:szCs w:val="15"/>
               </w:rPr>
-              <w:t xml:space="preserve">2-1-1</w:t>
+              <w:t xml:space="preserve">2-1-2</w:t>
             </w:r>
           </w:p>
         </w:tc>
@@ -10843,7 +10843,7 @@
                 <w:sz w:val="17"/>
                 <w:szCs w:val="17"/>
               </w:rPr>
-              <w:t xml:space="preserve">Slight knee dip, drive up and press overhead in one motion.</w:t>
+              <w:t xml:space="preserve">Hip hinge, flat back, pull both DBs to lower ribs.</w:t>
             </w:r>
           </w:p>
         </w:tc>

</xml_diff>